<commit_message>
mod_4: env var fixes, upload path, console logging, command-line entry point
- .env naming aligned to server standard (DBHOST, DBPASSWORD, USERDB, DBUSER)
- UPLOAD_BASE_DIR env var replaces hardcoded upload path (prod: /share/nfs-ceph/uploads)
- Scoping fix: upload_base_dir read inside call_code_a_validation() where needed
- TeeOutput class and console logging restored from mod_3
- CONSOLE_LOG env var toggle (off by default, set true in .env to enable)
- if __name__ == '__main__' entry point added for direct console execution:
  python3 validate_subscription_isp_mod_4.py {isp_id} {yyyy-mm-dd} {user_email}

Co-Authored-By: Claude Sonnet 4.6 <noreply@anthropic.com>
</commit_message>
<xml_diff>
--- a/Documentation/Procedure – How to manually run a subscriber file on the production server.docx
+++ b/Documentation/Procedure – How to manually run a subscriber file on the production server.docx
@@ -14,19 +14,11 @@
     </w:p>
     <w:p>
       <w:r>
-        <w:t>This assumes the subscriber file is located at this directory level var/www/broadband/uploads</w:t>
-      </w:r>
-      <w:proofErr w:type="gramStart"/>
-      <w:r>
-        <w:t>/”</w:t>
-      </w:r>
-      <w:proofErr w:type="spellStart"/>
-      <w:r>
-        <w:t>isp</w:t>
-      </w:r>
-      <w:proofErr w:type="gramEnd"/>
-      <w:r>
-        <w:t>_id</w:t>
+        <w:t>This assumes the subscriber file is located at this directory level var/www/broadband/uploads/”</w:t>
+      </w:r>
+      <w:proofErr w:type="spellStart"/>
+      <w:r>
+        <w:t>isp_id</w:t>
       </w:r>
       <w:proofErr w:type="spellEnd"/>
       <w:r>
@@ -54,12 +46,39 @@
         <w:t xml:space="preserve">ssh </w:t>
       </w:r>
       <w:r>
+        <w:t>rsi</w:t>
+      </w:r>
+      <w:r>
         <w:t>root</w:t>
       </w:r>
       <w:r>
-        <w:t>@www.regulatorysolutions.us -p 22</w:t>
-      </w:r>
-    </w:p>
+        <w:t>@w</w:t>
+      </w:r>
+      <w:r>
+        <w:t>ww.</w:t>
+      </w:r>
+      <w:r>
+        <w:t>regulatorysolutions.us -p 22</w:t>
+      </w:r>
+    </w:p>
+    <w:p>
+      <w:r>
+        <w:t>Enter this command</w:t>
+      </w:r>
+      <w:r>
+        <w:t xml:space="preserve"> (dev server)</w:t>
+      </w:r>
+      <w:r>
+        <w:t xml:space="preserve">:  </w:t>
+      </w:r>
+      <w:r>
+        <w:rPr>
+          <w:highlight w:val="yellow"/>
+        </w:rPr>
+        <w:t>ssh rsiroot@ds1.regulatorysolutions.us -p 22</w:t>
+      </w:r>
+    </w:p>
+    <w:p/>
     <w:p>
       <w:r>
         <w:t xml:space="preserve">Type in the Password:  </w:t>
@@ -347,7 +366,6 @@
           <w:sz w:val="22"/>
           <w:szCs w:val="22"/>
         </w:rPr>
-        <w:lastRenderedPageBreak/>
         <w:t>find /var/www/broadband/</w:t>
       </w:r>
       <w:proofErr w:type="spellStart"/>
@@ -624,13 +642,8 @@
         <w:t xml:space="preserve">-mm-dd. When this occurs, the program needs to push ‘processing’ to the </w:t>
       </w:r>
       <w:proofErr w:type="spellStart"/>
-      <w:proofErr w:type="gramStart"/>
-      <w:r>
-        <w:t>broadband.filer</w:t>
-      </w:r>
-      <w:proofErr w:type="gramEnd"/>
-      <w:r>
-        <w:t>_processing_status</w:t>
+      <w:r>
+        <w:t>broadband.filer_processing_status</w:t>
       </w:r>
       <w:proofErr w:type="spellEnd"/>
       <w:r>
@@ -669,13 +682,8 @@
         <w:t xml:space="preserve"> code. This code already sends data to </w:t>
       </w:r>
       <w:proofErr w:type="spellStart"/>
-      <w:proofErr w:type="gramStart"/>
-      <w:r>
-        <w:t>broadband.filer</w:t>
-      </w:r>
-      <w:proofErr w:type="gramEnd"/>
-      <w:r>
-        <w:t>_processing_status</w:t>
+      <w:r>
+        <w:t>broadband.filer_processing_status</w:t>
       </w:r>
       <w:proofErr w:type="spellEnd"/>
       <w:r>
@@ -691,6 +699,7 @@
       </w:r>
       <w:proofErr w:type="spellStart"/>
       <w:r>
+        <w:lastRenderedPageBreak/>
         <w:t>subscription_status</w:t>
       </w:r>
       <w:proofErr w:type="spellEnd"/>
@@ -703,11 +712,7 @@
       </w:r>
       <w:proofErr w:type="spellEnd"/>
       <w:r>
-        <w:t xml:space="preserve"> both at the start and finish of the validation process. At the start of the </w:t>
-      </w:r>
-      <w:r>
-        <w:lastRenderedPageBreak/>
-        <w:t xml:space="preserve">program, we will want to update the </w:t>
+        <w:t xml:space="preserve"> both at the start and finish of the validation process. At the start of the program, we will want to update the </w:t>
       </w:r>
       <w:proofErr w:type="spellStart"/>
       <w:r>

</xml_diff>